<commit_message>
Se agrega  en bton.js funcion para formatear caracteres en el input para separar centenas. en generar acuerdo se formatea el texto.
Se elimina de la hoja resumen, el apartado de banco
</commit_message>
<xml_diff>
--- a/formatos/acuerdo_con_ads_juridica.docx
+++ b/formatos/acuerdo_con_ads_juridica.docx
@@ -5101,7 +5101,6 @@
     </w:p>
     <w:p>
       <w:pPr>
-        <w:jc w:val="both"/>
         <w:rPr>
           <w:rFonts w:ascii="Garamond" w:eastAsia="Garamond" w:hAnsi="Garamond" w:cs="Garamond"/>
           <w:sz w:val="23"/>
@@ -22764,28 +22763,28 @@
 </file>
 
 <file path=customXml/item1.xml><?xml version="1.0" encoding="utf-8"?>
-<b:Sources xmlns:b="http://schemas.openxmlformats.org/officeDocument/2006/bibliography" xmlns="http://schemas.openxmlformats.org/officeDocument/2006/bibliography" SelectedStyle="\APASixthEditionOfficeOnline.xsl" StyleName="APA" Version="6"/>
-</file>
-
-<file path=customXml/item2.xml><?xml version="1.0" encoding="utf-8"?>
 <go:gDocsCustomXmlDataStorage xmlns:go="http://customooxmlschemas.google.com/" xmlns:r="http://schemas.openxmlformats.org/officeDocument/2006/relationships" uri="GoogleDocsCustomDataVersion2">
   <go:docsCustomData xmlns:go="http://customooxmlschemas.google.com/" roundtripDataSignature="AMtx7mi//yQ/oiAx+PSUT/f6fDOlIWWg4Q==">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</go:docsCustomData>
 </go:gDocsCustomXmlDataStorage>
 </file>
 
-<file path=customXml/itemProps1.xml><?xml version="1.0" encoding="utf-8"?>
-<ds:datastoreItem xmlns:ds="http://schemas.openxmlformats.org/officeDocument/2006/customXml" ds:itemID="{7D740D00-A2A0-41C6-9963-D2931C5396EA}">
-  <ds:schemaRefs>
-    <ds:schemaRef ds:uri="http://schemas.openxmlformats.org/officeDocument/2006/bibliography"/>
-  </ds:schemaRefs>
-</ds:datastoreItem>
+<file path=customXml/item2.xml><?xml version="1.0" encoding="utf-8"?>
+<b:Sources xmlns:b="http://schemas.openxmlformats.org/officeDocument/2006/bibliography" xmlns="http://schemas.openxmlformats.org/officeDocument/2006/bibliography" SelectedStyle="\APASixthEditionOfficeOnline.xsl" StyleName="APA" Version="6"/>
 </file>
 
-<file path=customXml/itemProps2.xml><?xml version="1.0" encoding="utf-8"?>
+<file path=customXml/itemProps1.xml><?xml version="1.0" encoding="utf-8"?>
 <ds:datastoreItem xmlns:ds="http://schemas.openxmlformats.org/officeDocument/2006/customXml" ds:itemID="{11111111-1234-1234-1234-123412341234}">
   <ds:schemaRefs>
     <ds:schemaRef ds:uri="http://customooxmlschemas.google.com/"/>
     <ds:schemaRef ds:uri="http://schemas.openxmlformats.org/officeDocument/2006/relationships"/>
   </ds:schemaRefs>
 </ds:datastoreItem>
+</file>
+
+<file path=customXml/itemProps2.xml><?xml version="1.0" encoding="utf-8"?>
+<ds:datastoreItem xmlns:ds="http://schemas.openxmlformats.org/officeDocument/2006/customXml" ds:itemID="{7D740D00-A2A0-41C6-9963-D2931C5396EA}">
+  <ds:schemaRefs>
+    <ds:schemaRef ds:uri="http://schemas.openxmlformats.org/officeDocument/2006/bibliography"/>
+  </ds:schemaRefs>
+</ds:datastoreItem>
 </file>
</xml_diff>

<commit_message>
Se actualiza formateo de nombre y razón social. Se elimina Upper de filtros jinja en los formatos.
</commit_message>
<xml_diff>
--- a/formatos/acuerdo_con_ads_juridica.docx
+++ b/formatos/acuerdo_con_ads_juridica.docx
@@ -588,6 +588,82 @@
         </w:rPr>
         <w:t xml:space="preserve"> </w:t>
       </w:r>
+      <w:r>
+        <w:rPr>
+          <w:rFonts w:ascii="Garamond" w:eastAsia="Garamond" w:hAnsi="Garamond" w:cs="Garamond"/>
+          <w:sz w:val="23"/>
+          <w:szCs w:val="23"/>
+          <w:highlight w:val="yellow"/>
+        </w:rPr>
+        <w:t>N</w:t>
+      </w:r>
+      <w:proofErr w:type="gramEnd"/>
+      <w:r>
+        <w:rPr>
+          <w:rFonts w:ascii="Garamond" w:eastAsia="Garamond" w:hAnsi="Garamond" w:cs="Garamond"/>
+          <w:sz w:val="23"/>
+          <w:szCs w:val="23"/>
+          <w:highlight w:val="yellow"/>
+        </w:rPr>
+        <w:t>_</w:t>
+      </w:r>
+      <w:proofErr w:type="gramStart"/>
+      <w:r>
+        <w:rPr>
+          <w:rFonts w:ascii="Garamond" w:eastAsia="Garamond" w:hAnsi="Garamond" w:cs="Garamond"/>
+          <w:sz w:val="23"/>
+          <w:szCs w:val="23"/>
+          <w:highlight w:val="yellow"/>
+          <w:u w:val="single"/>
+        </w:rPr>
+        <w:t>ESCRITURA</w:t>
+      </w:r>
+      <w:r>
+        <w:rPr>
+          <w:rFonts w:ascii="Garamond" w:eastAsia="Garamond" w:hAnsi="Garamond" w:cs="Garamond"/>
+          <w:sz w:val="23"/>
+          <w:szCs w:val="23"/>
+          <w:highlight w:val="yellow"/>
+        </w:rPr>
+        <w:t xml:space="preserve"> </w:t>
+      </w:r>
+      <w:r>
+        <w:rPr>
+          <w:rFonts w:ascii="Garamond" w:eastAsia="Garamond" w:hAnsi="Garamond" w:cs="Garamond"/>
+          <w:sz w:val="23"/>
+          <w:szCs w:val="23"/>
+          <w:highlight w:val="yellow"/>
+        </w:rPr>
+        <w:t>}</w:t>
+      </w:r>
+      <w:proofErr w:type="gramEnd"/>
+      <w:r>
+        <w:rPr>
+          <w:rFonts w:ascii="Garamond" w:eastAsia="Garamond" w:hAnsi="Garamond" w:cs="Garamond"/>
+          <w:sz w:val="23"/>
+          <w:szCs w:val="23"/>
+          <w:highlight w:val="yellow"/>
+        </w:rPr>
+        <w:t>}</w:t>
+      </w:r>
+      <w:r>
+        <w:rPr>
+          <w:rFonts w:ascii="Garamond" w:eastAsia="Garamond" w:hAnsi="Garamond" w:cs="Garamond"/>
+          <w:sz w:val="23"/>
+          <w:szCs w:val="23"/>
+        </w:rPr>
+        <w:t xml:space="preserve"> de fecha </w:t>
+      </w:r>
+      <w:proofErr w:type="gramStart"/>
+      <w:r>
+        <w:rPr>
+          <w:rFonts w:ascii="Garamond" w:eastAsia="Garamond" w:hAnsi="Garamond" w:cs="Garamond"/>
+          <w:sz w:val="23"/>
+          <w:szCs w:val="23"/>
+          <w:highlight w:val="yellow"/>
+        </w:rPr>
+        <w:t xml:space="preserve">{{ </w:t>
+      </w:r>
       <w:proofErr w:type="spellStart"/>
       <w:r>
         <w:rPr>
@@ -596,6 +672,92 @@
           <w:szCs w:val="23"/>
           <w:highlight w:val="yellow"/>
         </w:rPr>
+        <w:t>FECHA</w:t>
+      </w:r>
+      <w:proofErr w:type="gramEnd"/>
+      <w:r>
+        <w:rPr>
+          <w:rFonts w:ascii="Garamond" w:eastAsia="Garamond" w:hAnsi="Garamond" w:cs="Garamond"/>
+          <w:sz w:val="23"/>
+          <w:szCs w:val="23"/>
+          <w:highlight w:val="yellow"/>
+        </w:rPr>
+        <w:t>_ESCRITURA|</w:t>
+      </w:r>
+      <w:proofErr w:type="gramStart"/>
+      <w:r>
+        <w:rPr>
+          <w:rFonts w:ascii="Garamond" w:eastAsia="Garamond" w:hAnsi="Garamond" w:cs="Garamond"/>
+          <w:sz w:val="23"/>
+          <w:szCs w:val="23"/>
+          <w:highlight w:val="yellow"/>
+          <w:u w:val="single"/>
+        </w:rPr>
+        <w:t>lower</w:t>
+      </w:r>
+      <w:proofErr w:type="spellEnd"/>
+      <w:r>
+        <w:rPr>
+          <w:rFonts w:ascii="Garamond" w:eastAsia="Garamond" w:hAnsi="Garamond" w:cs="Garamond"/>
+          <w:sz w:val="23"/>
+          <w:szCs w:val="23"/>
+          <w:highlight w:val="yellow"/>
+        </w:rPr>
+        <w:t xml:space="preserve"> }</w:t>
+      </w:r>
+      <w:proofErr w:type="gramEnd"/>
+      <w:r>
+        <w:rPr>
+          <w:rFonts w:ascii="Garamond" w:eastAsia="Garamond" w:hAnsi="Garamond" w:cs="Garamond"/>
+          <w:sz w:val="23"/>
+          <w:szCs w:val="23"/>
+          <w:highlight w:val="yellow"/>
+        </w:rPr>
+        <w:t>}</w:t>
+      </w:r>
+      <w:r>
+        <w:rPr>
+          <w:rFonts w:ascii="Garamond" w:eastAsia="Garamond" w:hAnsi="Garamond" w:cs="Garamond"/>
+          <w:sz w:val="23"/>
+          <w:szCs w:val="23"/>
+        </w:rPr>
+        <w:t xml:space="preserve"> pasada ante la fe </w:t>
+      </w:r>
+      <w:r>
+        <w:rPr>
+          <w:rFonts w:ascii="Garamond" w:eastAsia="Garamond" w:hAnsi="Garamond" w:cs="Garamond"/>
+          <w:sz w:val="23"/>
+          <w:szCs w:val="23"/>
+          <w:u w:val="single"/>
+        </w:rPr>
+        <w:t>del</w:t>
+      </w:r>
+      <w:r>
+        <w:rPr>
+          <w:rFonts w:ascii="Garamond" w:eastAsia="Garamond" w:hAnsi="Garamond" w:cs="Garamond"/>
+          <w:sz w:val="23"/>
+          <w:szCs w:val="23"/>
+        </w:rPr>
+        <w:t xml:space="preserve"> Lic. </w:t>
+      </w:r>
+      <w:proofErr w:type="gramStart"/>
+      <w:r>
+        <w:rPr>
+          <w:rFonts w:ascii="Garamond" w:eastAsia="Garamond" w:hAnsi="Garamond" w:cs="Garamond"/>
+          <w:sz w:val="23"/>
+          <w:szCs w:val="23"/>
+          <w:highlight w:val="yellow"/>
+        </w:rPr>
+        <w:t xml:space="preserve">{{ </w:t>
+      </w:r>
+      <w:proofErr w:type="spellStart"/>
+      <w:r>
+        <w:rPr>
+          <w:rFonts w:ascii="Garamond" w:eastAsia="Garamond" w:hAnsi="Garamond" w:cs="Garamond"/>
+          <w:sz w:val="23"/>
+          <w:szCs w:val="23"/>
+          <w:highlight w:val="yellow"/>
+        </w:rPr>
         <w:t>N</w:t>
       </w:r>
       <w:proofErr w:type="gramEnd"/>
@@ -606,7 +768,16 @@
           <w:szCs w:val="23"/>
           <w:highlight w:val="yellow"/>
         </w:rPr>
-        <w:t>_ESCRITURA|</w:t>
+        <w:t>_LIC</w:t>
+      </w:r>
+      <w:r>
+        <w:rPr>
+          <w:rFonts w:ascii="Garamond" w:eastAsia="Garamond" w:hAnsi="Garamond" w:cs="Garamond"/>
+          <w:sz w:val="23"/>
+          <w:szCs w:val="23"/>
+          <w:highlight w:val="yellow"/>
+        </w:rPr>
+        <w:t>|</w:t>
       </w:r>
       <w:proofErr w:type="gramStart"/>
       <w:r>
@@ -644,6 +815,186 @@
           <w:sz w:val="23"/>
           <w:szCs w:val="23"/>
         </w:rPr>
+        <w:t xml:space="preserve"> </w:t>
+      </w:r>
+      <w:r>
+        <w:rPr>
+          <w:rFonts w:ascii="Garamond" w:eastAsia="Garamond" w:hAnsi="Garamond" w:cs="Garamond"/>
+          <w:sz w:val="23"/>
+          <w:szCs w:val="23"/>
+        </w:rPr>
+        <w:t>Notario</w:t>
+      </w:r>
+      <w:r>
+        <w:rPr>
+          <w:rFonts w:ascii="Garamond" w:eastAsia="Garamond" w:hAnsi="Garamond" w:cs="Garamond"/>
+          <w:sz w:val="23"/>
+          <w:szCs w:val="23"/>
+        </w:rPr>
+        <w:t xml:space="preserve"> Público </w:t>
+      </w:r>
+      <w:proofErr w:type="gramStart"/>
+      <w:r>
+        <w:rPr>
+          <w:rFonts w:ascii="Garamond" w:eastAsia="Garamond" w:hAnsi="Garamond" w:cs="Garamond"/>
+          <w:sz w:val="23"/>
+          <w:szCs w:val="23"/>
+          <w:highlight w:val="yellow"/>
+        </w:rPr>
+        <w:t>{{ NUMERO</w:t>
+      </w:r>
+      <w:proofErr w:type="gramEnd"/>
+      <w:r>
+        <w:rPr>
+          <w:rFonts w:ascii="Garamond" w:eastAsia="Garamond" w:hAnsi="Garamond" w:cs="Garamond"/>
+          <w:sz w:val="23"/>
+          <w:szCs w:val="23"/>
+          <w:highlight w:val="yellow"/>
+        </w:rPr>
+        <w:t>_</w:t>
+      </w:r>
+      <w:proofErr w:type="gramStart"/>
+      <w:r>
+        <w:rPr>
+          <w:rFonts w:ascii="Garamond" w:eastAsia="Garamond" w:hAnsi="Garamond" w:cs="Garamond"/>
+          <w:sz w:val="23"/>
+          <w:szCs w:val="23"/>
+          <w:highlight w:val="yellow"/>
+        </w:rPr>
+        <w:t>NOTARIO }</w:t>
+      </w:r>
+      <w:proofErr w:type="gramEnd"/>
+      <w:r>
+        <w:rPr>
+          <w:rFonts w:ascii="Garamond" w:eastAsia="Garamond" w:hAnsi="Garamond" w:cs="Garamond"/>
+          <w:sz w:val="23"/>
+          <w:szCs w:val="23"/>
+          <w:highlight w:val="yellow"/>
+        </w:rPr>
+        <w:t>}</w:t>
+      </w:r>
+      <w:r>
+        <w:rPr>
+          <w:rFonts w:ascii="Garamond" w:eastAsia="Garamond" w:hAnsi="Garamond" w:cs="Garamond"/>
+          <w:sz w:val="23"/>
+          <w:szCs w:val="23"/>
+        </w:rPr>
+        <w:t xml:space="preserve"> de </w:t>
+      </w:r>
+      <w:proofErr w:type="gramStart"/>
+      <w:r>
+        <w:rPr>
+          <w:rFonts w:ascii="Garamond" w:eastAsia="Garamond" w:hAnsi="Garamond" w:cs="Garamond"/>
+          <w:sz w:val="23"/>
+          <w:szCs w:val="23"/>
+          <w:highlight w:val="yellow"/>
+        </w:rPr>
+        <w:t xml:space="preserve">{{ </w:t>
+      </w:r>
+      <w:proofErr w:type="spellStart"/>
+      <w:r>
+        <w:rPr>
+          <w:rFonts w:ascii="Garamond" w:eastAsia="Garamond" w:hAnsi="Garamond" w:cs="Garamond"/>
+          <w:sz w:val="23"/>
+          <w:szCs w:val="23"/>
+          <w:highlight w:val="yellow"/>
+        </w:rPr>
+        <w:t>UBICACIÓN</w:t>
+      </w:r>
+      <w:proofErr w:type="gramEnd"/>
+      <w:r>
+        <w:rPr>
+          <w:rFonts w:ascii="Garamond" w:eastAsia="Garamond" w:hAnsi="Garamond" w:cs="Garamond"/>
+          <w:sz w:val="23"/>
+          <w:szCs w:val="23"/>
+          <w:highlight w:val="yellow"/>
+        </w:rPr>
+        <w:t>_NOTARIA|</w:t>
+      </w:r>
+      <w:proofErr w:type="gramStart"/>
+      <w:r>
+        <w:rPr>
+          <w:rFonts w:ascii="Garamond" w:eastAsia="Garamond" w:hAnsi="Garamond" w:cs="Garamond"/>
+          <w:sz w:val="23"/>
+          <w:szCs w:val="23"/>
+          <w:highlight w:val="yellow"/>
+        </w:rPr>
+        <w:t>title</w:t>
+      </w:r>
+      <w:proofErr w:type="spellEnd"/>
+      <w:r>
+        <w:rPr>
+          <w:rFonts w:ascii="Garamond" w:eastAsia="Garamond" w:hAnsi="Garamond" w:cs="Garamond"/>
+          <w:sz w:val="23"/>
+          <w:szCs w:val="23"/>
+          <w:highlight w:val="yellow"/>
+        </w:rPr>
+        <w:t xml:space="preserve"> }</w:t>
+      </w:r>
+      <w:proofErr w:type="gramEnd"/>
+      <w:r>
+        <w:rPr>
+          <w:rFonts w:ascii="Garamond" w:eastAsia="Garamond" w:hAnsi="Garamond" w:cs="Garamond"/>
+          <w:sz w:val="23"/>
+          <w:szCs w:val="23"/>
+          <w:highlight w:val="yellow"/>
+        </w:rPr>
+        <w:t>}</w:t>
+      </w:r>
+      <w:r>
+        <w:rPr>
+          <w:rFonts w:ascii="Garamond" w:eastAsia="Garamond" w:hAnsi="Garamond" w:cs="Garamond"/>
+          <w:sz w:val="23"/>
+          <w:szCs w:val="23"/>
+        </w:rPr>
+        <w:t xml:space="preserve"> e inscrita en el Registro Público de Propiedad y Comercio bajo el Folio Mercantil Número </w:t>
+      </w:r>
+      <w:proofErr w:type="gramStart"/>
+      <w:r>
+        <w:rPr>
+          <w:rFonts w:ascii="Garamond" w:eastAsia="Garamond" w:hAnsi="Garamond" w:cs="Garamond"/>
+          <w:sz w:val="23"/>
+          <w:szCs w:val="23"/>
+          <w:highlight w:val="yellow"/>
+        </w:rPr>
+        <w:t>{{ N</w:t>
+      </w:r>
+      <w:proofErr w:type="gramEnd"/>
+      <w:r>
+        <w:rPr>
+          <w:rFonts w:ascii="Garamond" w:eastAsia="Garamond" w:hAnsi="Garamond" w:cs="Garamond"/>
+          <w:sz w:val="23"/>
+          <w:szCs w:val="23"/>
+          <w:highlight w:val="yellow"/>
+        </w:rPr>
+        <w:t>_</w:t>
+      </w:r>
+      <w:proofErr w:type="gramStart"/>
+      <w:r>
+        <w:rPr>
+          <w:rFonts w:ascii="Garamond" w:eastAsia="Garamond" w:hAnsi="Garamond" w:cs="Garamond"/>
+          <w:sz w:val="23"/>
+          <w:szCs w:val="23"/>
+          <w:highlight w:val="yellow"/>
+        </w:rPr>
+        <w:t>FOLIO }</w:t>
+      </w:r>
+      <w:proofErr w:type="gramEnd"/>
+      <w:r>
+        <w:rPr>
+          <w:rFonts w:ascii="Garamond" w:eastAsia="Garamond" w:hAnsi="Garamond" w:cs="Garamond"/>
+          <w:sz w:val="23"/>
+          <w:szCs w:val="23"/>
+          <w:highlight w:val="yellow"/>
+        </w:rPr>
+        <w:t>}</w:t>
+      </w:r>
+      <w:r>
+        <w:rPr>
+          <w:rFonts w:ascii="Garamond" w:eastAsia="Garamond" w:hAnsi="Garamond" w:cs="Garamond"/>
+          <w:sz w:val="23"/>
+          <w:szCs w:val="23"/>
+        </w:rPr>
         <w:t xml:space="preserve"> de fecha </w:t>
       </w:r>
       <w:proofErr w:type="gramStart"/>
@@ -674,7 +1025,16 @@
           <w:szCs w:val="23"/>
           <w:highlight w:val="yellow"/>
         </w:rPr>
-        <w:t>_ESCRITURA|</w:t>
+        <w:t>_FOLIO</w:t>
+      </w:r>
+      <w:r>
+        <w:rPr>
+          <w:rFonts w:ascii="Garamond" w:eastAsia="Garamond" w:hAnsi="Garamond" w:cs="Garamond"/>
+          <w:sz w:val="23"/>
+          <w:szCs w:val="23"/>
+          <w:highlight w:val="yellow"/>
+        </w:rPr>
+        <w:t>|</w:t>
       </w:r>
       <w:proofErr w:type="gramStart"/>
       <w:r>
@@ -687,329 +1047,6 @@
         <w:t>lower</w:t>
       </w:r>
       <w:proofErr w:type="spellEnd"/>
-      <w:r>
-        <w:rPr>
-          <w:rFonts w:ascii="Garamond" w:eastAsia="Garamond" w:hAnsi="Garamond" w:cs="Garamond"/>
-          <w:sz w:val="23"/>
-          <w:szCs w:val="23"/>
-          <w:highlight w:val="yellow"/>
-        </w:rPr>
-        <w:t xml:space="preserve"> }</w:t>
-      </w:r>
-      <w:proofErr w:type="gramEnd"/>
-      <w:r>
-        <w:rPr>
-          <w:rFonts w:ascii="Garamond" w:eastAsia="Garamond" w:hAnsi="Garamond" w:cs="Garamond"/>
-          <w:sz w:val="23"/>
-          <w:szCs w:val="23"/>
-          <w:highlight w:val="yellow"/>
-        </w:rPr>
-        <w:t>}</w:t>
-      </w:r>
-      <w:r>
-        <w:rPr>
-          <w:rFonts w:ascii="Garamond" w:eastAsia="Garamond" w:hAnsi="Garamond" w:cs="Garamond"/>
-          <w:sz w:val="23"/>
-          <w:szCs w:val="23"/>
-        </w:rPr>
-        <w:t xml:space="preserve"> pasada ante la fe del Lic. </w:t>
-      </w:r>
-      <w:proofErr w:type="gramStart"/>
-      <w:r>
-        <w:rPr>
-          <w:rFonts w:ascii="Garamond" w:eastAsia="Garamond" w:hAnsi="Garamond" w:cs="Garamond"/>
-          <w:sz w:val="23"/>
-          <w:szCs w:val="23"/>
-          <w:highlight w:val="yellow"/>
-        </w:rPr>
-        <w:t xml:space="preserve">{{ </w:t>
-      </w:r>
-      <w:proofErr w:type="spellStart"/>
-      <w:r>
-        <w:rPr>
-          <w:rFonts w:ascii="Garamond" w:eastAsia="Garamond" w:hAnsi="Garamond" w:cs="Garamond"/>
-          <w:sz w:val="23"/>
-          <w:szCs w:val="23"/>
-          <w:highlight w:val="yellow"/>
-        </w:rPr>
-        <w:t>N</w:t>
-      </w:r>
-      <w:proofErr w:type="gramEnd"/>
-      <w:r>
-        <w:rPr>
-          <w:rFonts w:ascii="Garamond" w:eastAsia="Garamond" w:hAnsi="Garamond" w:cs="Garamond"/>
-          <w:sz w:val="23"/>
-          <w:szCs w:val="23"/>
-          <w:highlight w:val="yellow"/>
-        </w:rPr>
-        <w:t>_LIC</w:t>
-      </w:r>
-      <w:r>
-        <w:rPr>
-          <w:rFonts w:ascii="Garamond" w:eastAsia="Garamond" w:hAnsi="Garamond" w:cs="Garamond"/>
-          <w:sz w:val="23"/>
-          <w:szCs w:val="23"/>
-          <w:highlight w:val="yellow"/>
-        </w:rPr>
-        <w:t>|</w:t>
-      </w:r>
-      <w:proofErr w:type="gramStart"/>
-      <w:r>
-        <w:rPr>
-          <w:rFonts w:ascii="Garamond" w:eastAsia="Garamond" w:hAnsi="Garamond" w:cs="Garamond"/>
-          <w:sz w:val="23"/>
-          <w:szCs w:val="23"/>
-          <w:highlight w:val="yellow"/>
-        </w:rPr>
-        <w:t>title</w:t>
-      </w:r>
-      <w:proofErr w:type="spellEnd"/>
-      <w:r>
-        <w:rPr>
-          <w:rFonts w:ascii="Garamond" w:eastAsia="Garamond" w:hAnsi="Garamond" w:cs="Garamond"/>
-          <w:sz w:val="23"/>
-          <w:szCs w:val="23"/>
-          <w:highlight w:val="yellow"/>
-        </w:rPr>
-        <w:t xml:space="preserve"> }</w:t>
-      </w:r>
-      <w:proofErr w:type="gramEnd"/>
-      <w:r>
-        <w:rPr>
-          <w:rFonts w:ascii="Garamond" w:eastAsia="Garamond" w:hAnsi="Garamond" w:cs="Garamond"/>
-          <w:sz w:val="23"/>
-          <w:szCs w:val="23"/>
-          <w:highlight w:val="yellow"/>
-        </w:rPr>
-        <w:t>}</w:t>
-      </w:r>
-      <w:r>
-        <w:rPr>
-          <w:rFonts w:ascii="Garamond" w:eastAsia="Garamond" w:hAnsi="Garamond" w:cs="Garamond"/>
-          <w:sz w:val="23"/>
-          <w:szCs w:val="23"/>
-        </w:rPr>
-        <w:t xml:space="preserve"> </w:t>
-      </w:r>
-      <w:r>
-        <w:rPr>
-          <w:rFonts w:ascii="Garamond" w:eastAsia="Garamond" w:hAnsi="Garamond" w:cs="Garamond"/>
-          <w:sz w:val="23"/>
-          <w:szCs w:val="23"/>
-        </w:rPr>
-        <w:t>Notario</w:t>
-      </w:r>
-      <w:r>
-        <w:rPr>
-          <w:rFonts w:ascii="Garamond" w:eastAsia="Garamond" w:hAnsi="Garamond" w:cs="Garamond"/>
-          <w:sz w:val="23"/>
-          <w:szCs w:val="23"/>
-        </w:rPr>
-        <w:t xml:space="preserve"> Público </w:t>
-      </w:r>
-      <w:proofErr w:type="gramStart"/>
-      <w:r>
-        <w:rPr>
-          <w:rFonts w:ascii="Garamond" w:eastAsia="Garamond" w:hAnsi="Garamond" w:cs="Garamond"/>
-          <w:sz w:val="23"/>
-          <w:szCs w:val="23"/>
-          <w:highlight w:val="yellow"/>
-        </w:rPr>
-        <w:t>{{ NUMERO</w:t>
-      </w:r>
-      <w:proofErr w:type="gramEnd"/>
-      <w:r>
-        <w:rPr>
-          <w:rFonts w:ascii="Garamond" w:eastAsia="Garamond" w:hAnsi="Garamond" w:cs="Garamond"/>
-          <w:sz w:val="23"/>
-          <w:szCs w:val="23"/>
-          <w:highlight w:val="yellow"/>
-        </w:rPr>
-        <w:t>_</w:t>
-      </w:r>
-      <w:proofErr w:type="gramStart"/>
-      <w:r>
-        <w:rPr>
-          <w:rFonts w:ascii="Garamond" w:eastAsia="Garamond" w:hAnsi="Garamond" w:cs="Garamond"/>
-          <w:sz w:val="23"/>
-          <w:szCs w:val="23"/>
-          <w:highlight w:val="yellow"/>
-        </w:rPr>
-        <w:t>NOTARIO }</w:t>
-      </w:r>
-      <w:proofErr w:type="gramEnd"/>
-      <w:r>
-        <w:rPr>
-          <w:rFonts w:ascii="Garamond" w:eastAsia="Garamond" w:hAnsi="Garamond" w:cs="Garamond"/>
-          <w:sz w:val="23"/>
-          <w:szCs w:val="23"/>
-          <w:highlight w:val="yellow"/>
-        </w:rPr>
-        <w:t>}</w:t>
-      </w:r>
-      <w:r>
-        <w:rPr>
-          <w:rFonts w:ascii="Garamond" w:eastAsia="Garamond" w:hAnsi="Garamond" w:cs="Garamond"/>
-          <w:sz w:val="23"/>
-          <w:szCs w:val="23"/>
-        </w:rPr>
-        <w:t xml:space="preserve"> de </w:t>
-      </w:r>
-      <w:proofErr w:type="gramStart"/>
-      <w:r>
-        <w:rPr>
-          <w:rFonts w:ascii="Garamond" w:eastAsia="Garamond" w:hAnsi="Garamond" w:cs="Garamond"/>
-          <w:sz w:val="23"/>
-          <w:szCs w:val="23"/>
-          <w:highlight w:val="yellow"/>
-        </w:rPr>
-        <w:t xml:space="preserve">{{ </w:t>
-      </w:r>
-      <w:proofErr w:type="spellStart"/>
-      <w:r>
-        <w:rPr>
-          <w:rFonts w:ascii="Garamond" w:eastAsia="Garamond" w:hAnsi="Garamond" w:cs="Garamond"/>
-          <w:sz w:val="23"/>
-          <w:szCs w:val="23"/>
-          <w:highlight w:val="yellow"/>
-        </w:rPr>
-        <w:t>UBICACIÓN</w:t>
-      </w:r>
-      <w:proofErr w:type="gramEnd"/>
-      <w:r>
-        <w:rPr>
-          <w:rFonts w:ascii="Garamond" w:eastAsia="Garamond" w:hAnsi="Garamond" w:cs="Garamond"/>
-          <w:sz w:val="23"/>
-          <w:szCs w:val="23"/>
-          <w:highlight w:val="yellow"/>
-        </w:rPr>
-        <w:t>_NOTARIA|</w:t>
-      </w:r>
-      <w:proofErr w:type="gramStart"/>
-      <w:r>
-        <w:rPr>
-          <w:rFonts w:ascii="Garamond" w:eastAsia="Garamond" w:hAnsi="Garamond" w:cs="Garamond"/>
-          <w:sz w:val="23"/>
-          <w:szCs w:val="23"/>
-          <w:highlight w:val="yellow"/>
-        </w:rPr>
-        <w:t>title</w:t>
-      </w:r>
-      <w:proofErr w:type="spellEnd"/>
-      <w:r>
-        <w:rPr>
-          <w:rFonts w:ascii="Garamond" w:eastAsia="Garamond" w:hAnsi="Garamond" w:cs="Garamond"/>
-          <w:sz w:val="23"/>
-          <w:szCs w:val="23"/>
-          <w:highlight w:val="yellow"/>
-        </w:rPr>
-        <w:t xml:space="preserve"> }</w:t>
-      </w:r>
-      <w:proofErr w:type="gramEnd"/>
-      <w:r>
-        <w:rPr>
-          <w:rFonts w:ascii="Garamond" w:eastAsia="Garamond" w:hAnsi="Garamond" w:cs="Garamond"/>
-          <w:sz w:val="23"/>
-          <w:szCs w:val="23"/>
-          <w:highlight w:val="yellow"/>
-        </w:rPr>
-        <w:t>}</w:t>
-      </w:r>
-      <w:r>
-        <w:rPr>
-          <w:rFonts w:ascii="Garamond" w:eastAsia="Garamond" w:hAnsi="Garamond" w:cs="Garamond"/>
-          <w:sz w:val="23"/>
-          <w:szCs w:val="23"/>
-        </w:rPr>
-        <w:t xml:space="preserve"> e inscrita en el Registro Público de Propiedad y Comercio bajo el Folio Mercantil Número </w:t>
-      </w:r>
-      <w:proofErr w:type="gramStart"/>
-      <w:r>
-        <w:rPr>
-          <w:rFonts w:ascii="Garamond" w:eastAsia="Garamond" w:hAnsi="Garamond" w:cs="Garamond"/>
-          <w:sz w:val="23"/>
-          <w:szCs w:val="23"/>
-          <w:highlight w:val="yellow"/>
-        </w:rPr>
-        <w:t>{{ N</w:t>
-      </w:r>
-      <w:proofErr w:type="gramEnd"/>
-      <w:r>
-        <w:rPr>
-          <w:rFonts w:ascii="Garamond" w:eastAsia="Garamond" w:hAnsi="Garamond" w:cs="Garamond"/>
-          <w:sz w:val="23"/>
-          <w:szCs w:val="23"/>
-          <w:highlight w:val="yellow"/>
-        </w:rPr>
-        <w:t>_</w:t>
-      </w:r>
-      <w:proofErr w:type="gramStart"/>
-      <w:r>
-        <w:rPr>
-          <w:rFonts w:ascii="Garamond" w:eastAsia="Garamond" w:hAnsi="Garamond" w:cs="Garamond"/>
-          <w:sz w:val="23"/>
-          <w:szCs w:val="23"/>
-          <w:highlight w:val="yellow"/>
-        </w:rPr>
-        <w:t>FOLIO }</w:t>
-      </w:r>
-      <w:proofErr w:type="gramEnd"/>
-      <w:r>
-        <w:rPr>
-          <w:rFonts w:ascii="Garamond" w:eastAsia="Garamond" w:hAnsi="Garamond" w:cs="Garamond"/>
-          <w:sz w:val="23"/>
-          <w:szCs w:val="23"/>
-          <w:highlight w:val="yellow"/>
-        </w:rPr>
-        <w:t>}</w:t>
-      </w:r>
-      <w:r>
-        <w:rPr>
-          <w:rFonts w:ascii="Garamond" w:eastAsia="Garamond" w:hAnsi="Garamond" w:cs="Garamond"/>
-          <w:sz w:val="23"/>
-          <w:szCs w:val="23"/>
-        </w:rPr>
-        <w:t xml:space="preserve"> de fecha </w:t>
-      </w:r>
-      <w:proofErr w:type="gramStart"/>
-      <w:r>
-        <w:rPr>
-          <w:rFonts w:ascii="Garamond" w:eastAsia="Garamond" w:hAnsi="Garamond" w:cs="Garamond"/>
-          <w:sz w:val="23"/>
-          <w:szCs w:val="23"/>
-          <w:highlight w:val="yellow"/>
-        </w:rPr>
-        <w:t>{{ FECHA</w:t>
-      </w:r>
-      <w:proofErr w:type="gramEnd"/>
-      <w:r>
-        <w:rPr>
-          <w:rFonts w:ascii="Garamond" w:eastAsia="Garamond" w:hAnsi="Garamond" w:cs="Garamond"/>
-          <w:sz w:val="23"/>
-          <w:szCs w:val="23"/>
-          <w:highlight w:val="yellow"/>
-        </w:rPr>
-        <w:t>_FOLIO</w:t>
-      </w:r>
-      <w:r>
-        <w:rPr>
-          <w:rFonts w:ascii="Garamond" w:eastAsia="Garamond" w:hAnsi="Garamond" w:cs="Garamond"/>
-          <w:sz w:val="23"/>
-          <w:szCs w:val="23"/>
-          <w:highlight w:val="yellow"/>
-        </w:rPr>
-        <w:t>|</w:t>
-      </w:r>
-      <w:proofErr w:type="gramStart"/>
-      <w:r>
-        <w:rPr>
-          <w:rFonts w:ascii="Garamond" w:eastAsia="Garamond" w:hAnsi="Garamond" w:cs="Garamond"/>
-          <w:sz w:val="23"/>
-          <w:szCs w:val="23"/>
-          <w:highlight w:val="yellow"/>
-        </w:rPr>
-        <w:t>lower</w:t>
-      </w:r>
       <w:r>
         <w:rPr>
           <w:rFonts w:ascii="Garamond" w:eastAsia="Garamond" w:hAnsi="Garamond" w:cs="Garamond"/>
@@ -1163,6 +1200,7 @@
           <w:rFonts w:ascii="Garamond" w:eastAsia="Garamond" w:hAnsi="Garamond" w:cs="Garamond"/>
           <w:sz w:val="23"/>
           <w:szCs w:val="23"/>
+          <w:u w:val="single"/>
         </w:rPr>
       </w:pPr>
     </w:p>
@@ -1213,16 +1251,7 @@
           <w:szCs w:val="23"/>
           <w:highlight w:val="yellow"/>
         </w:rPr>
-        <w:t>_RAZÓN_SOCIAL</w:t>
-      </w:r>
-      <w:r>
-        <w:rPr>
-          <w:rFonts w:ascii="Garamond" w:eastAsia="Garamond" w:hAnsi="Garamond" w:cs="Garamond"/>
-          <w:sz w:val="23"/>
-          <w:szCs w:val="23"/>
-          <w:highlight w:val="yellow"/>
-        </w:rPr>
-        <w:t>|</w:t>
+        <w:t>_RAZÓN_</w:t>
       </w:r>
       <w:proofErr w:type="gramStart"/>
       <w:r>
@@ -1232,16 +1261,7 @@
           <w:szCs w:val="23"/>
           <w:highlight w:val="yellow"/>
         </w:rPr>
-        <w:t>title</w:t>
-      </w:r>
-      <w:r>
-        <w:rPr>
-          <w:rFonts w:ascii="Garamond" w:eastAsia="Garamond" w:hAnsi="Garamond" w:cs="Garamond"/>
-          <w:sz w:val="23"/>
-          <w:szCs w:val="23"/>
-          <w:highlight w:val="yellow"/>
-        </w:rPr>
-        <w:t xml:space="preserve"> }</w:t>
+        <w:t>SOCIAL }</w:t>
       </w:r>
       <w:proofErr w:type="gramEnd"/>
       <w:r>
@@ -5799,6 +5819,7 @@
           <w:rFonts w:ascii="Garamond" w:eastAsia="Garamond" w:hAnsi="Garamond" w:cs="Garamond"/>
           <w:sz w:val="23"/>
           <w:szCs w:val="23"/>
+          <w:u w:val="single"/>
         </w:rPr>
       </w:pPr>
     </w:p>
@@ -5876,9 +5897,9 @@
           <w:highlight w:val="yellow"/>
           <w:lang w:val="es-ES"/>
         </w:rPr>
-        <w:t xml:space="preserve">{{ </w:t>
-      </w:r>
-      <w:proofErr w:type="spellStart"/>
+        <w:t>{{ RAZÓN</w:t>
+      </w:r>
+      <w:proofErr w:type="gramEnd"/>
       <w:r>
         <w:rPr>
           <w:rFonts w:ascii="Garamond" w:eastAsia="Garamond" w:hAnsi="Garamond" w:cs="Garamond"/>
@@ -5889,9 +5910,9 @@
           <w:highlight w:val="yellow"/>
           <w:lang w:val="es-ES"/>
         </w:rPr>
-        <w:t>RAZÓN</w:t>
-      </w:r>
-      <w:proofErr w:type="gramEnd"/>
+        <w:t>_</w:t>
+      </w:r>
+      <w:proofErr w:type="gramStart"/>
       <w:r>
         <w:rPr>
           <w:rFonts w:ascii="Garamond" w:eastAsia="Garamond" w:hAnsi="Garamond" w:cs="Garamond"/>
@@ -5902,45 +5923,7 @@
           <w:highlight w:val="yellow"/>
           <w:lang w:val="es-ES"/>
         </w:rPr>
-        <w:t>_SOCIAL</w:t>
-      </w:r>
-      <w:r>
-        <w:rPr>
-          <w:rFonts w:ascii="Garamond" w:eastAsia="Garamond" w:hAnsi="Garamond" w:cs="Garamond"/>
-          <w:i/>
-          <w:iCs/>
-          <w:sz w:val="23"/>
-          <w:szCs w:val="23"/>
-          <w:highlight w:val="yellow"/>
-          <w:lang w:val="es-ES"/>
-        </w:rPr>
-        <w:t>|</w:t>
-      </w:r>
-      <w:proofErr w:type="gramStart"/>
-      <w:r>
-        <w:rPr>
-          <w:rFonts w:ascii="Garamond" w:eastAsia="Garamond" w:hAnsi="Garamond" w:cs="Garamond"/>
-          <w:i/>
-          <w:iCs/>
-          <w:sz w:val="23"/>
-          <w:szCs w:val="23"/>
-          <w:highlight w:val="yellow"/>
-          <w:lang w:val="es-ES"/>
-        </w:rPr>
-        <w:t>upper</w:t>
-      </w:r>
-      <w:proofErr w:type="spellEnd"/>
-      <w:r>
-        <w:rPr>
-          <w:rFonts w:ascii="Garamond" w:eastAsia="Garamond" w:hAnsi="Garamond" w:cs="Garamond"/>
-          <w:i/>
-          <w:iCs/>
-          <w:sz w:val="23"/>
-          <w:szCs w:val="23"/>
-          <w:highlight w:val="yellow"/>
-          <w:lang w:val="es-ES"/>
-        </w:rPr>
-        <w:t xml:space="preserve"> }</w:t>
+        <w:t>SOCIAL }</w:t>
       </w:r>
       <w:proofErr w:type="gramEnd"/>
       <w:r>
@@ -6062,6 +6045,7 @@
           <w:sz w:val="23"/>
           <w:szCs w:val="23"/>
           <w:highlight w:val="yellow"/>
+          <w:u w:val="single"/>
         </w:rPr>
       </w:pPr>
       <w:proofErr w:type="spellStart"/>
@@ -6073,6 +6057,7 @@
           <w:sz w:val="23"/>
           <w:szCs w:val="23"/>
           <w:highlight w:val="yellow"/>
+          <w:u w:val="single"/>
         </w:rPr>
         <w:t>Clabe</w:t>
       </w:r>
@@ -6085,6 +6070,7 @@
           <w:sz w:val="23"/>
           <w:szCs w:val="23"/>
           <w:highlight w:val="yellow"/>
+          <w:u w:val="single"/>
         </w:rPr>
         <w:t xml:space="preserve"> Interbancaria:</w:t>
       </w:r>
@@ -6096,6 +6082,7 @@
           <w:sz w:val="23"/>
           <w:szCs w:val="23"/>
           <w:highlight w:val="yellow"/>
+          <w:u w:val="single"/>
         </w:rPr>
         <w:t xml:space="preserve"> </w:t>
       </w:r>
@@ -6108,6 +6095,7 @@
           <w:sz w:val="23"/>
           <w:szCs w:val="23"/>
           <w:highlight w:val="yellow"/>
+          <w:u w:val="single"/>
         </w:rPr>
         <w:t>{{ N</w:t>
       </w:r>
@@ -6120,6 +6108,7 @@
           <w:sz w:val="23"/>
           <w:szCs w:val="23"/>
           <w:highlight w:val="yellow"/>
+          <w:u w:val="single"/>
         </w:rPr>
         <w:t>_</w:t>
       </w:r>
@@ -6132,6 +6121,7 @@
           <w:sz w:val="23"/>
           <w:szCs w:val="23"/>
           <w:highlight w:val="yellow"/>
+          <w:u w:val="single"/>
         </w:rPr>
         <w:t>CLABE }</w:t>
       </w:r>
@@ -6144,6 +6134,7 @@
           <w:sz w:val="23"/>
           <w:szCs w:val="23"/>
           <w:highlight w:val="yellow"/>
+          <w:u w:val="single"/>
         </w:rPr>
         <w:t>}</w:t>
       </w:r>
@@ -6155,6 +6146,7 @@
           <w:sz w:val="23"/>
           <w:szCs w:val="23"/>
           <w:highlight w:val="yellow"/>
+          <w:u w:val="single"/>
         </w:rPr>
         <w:t xml:space="preserve"> </w:t>
       </w:r>
@@ -6240,7 +6232,7 @@
           <w:szCs w:val="23"/>
           <w:highlight w:val="yellow"/>
         </w:rPr>
-        <w:t>upper</w:t>
+        <w:t>title</w:t>
       </w:r>
       <w:proofErr w:type="spellEnd"/>
       <w:r>
@@ -8136,6 +8128,7 @@
         </w:rPr>
         <w:t xml:space="preserve">CLÁUSULA </w:t>
       </w:r>
+      <w:proofErr w:type="gramStart"/>
       <w:r>
         <w:rPr>
           <w:rFonts w:ascii="Garamond" w:eastAsia="Garamond" w:hAnsi="Garamond" w:cs="Garamond"/>
@@ -8147,8 +8140,9 @@
           <w:u w:val="single"/>
           <w:lang w:val="es-MX"/>
         </w:rPr>
-        <w:t>{{ NUM_SEMI_EXCLUSIVIDAD</w:t>
-      </w:r>
+        <w:t xml:space="preserve">{{ </w:t>
+      </w:r>
+      <w:proofErr w:type="spellStart"/>
       <w:r>
         <w:rPr>
           <w:rFonts w:ascii="Garamond" w:eastAsia="Garamond" w:hAnsi="Garamond" w:cs="Garamond"/>
@@ -8160,8 +8154,9 @@
           <w:u w:val="single"/>
           <w:lang w:val="es-MX"/>
         </w:rPr>
-        <w:t>|upper</w:t>
-      </w:r>
+        <w:t>NUM</w:t>
+      </w:r>
+      <w:proofErr w:type="gramEnd"/>
       <w:r>
         <w:rPr>
           <w:rFonts w:ascii="Garamond" w:eastAsia="Garamond" w:hAnsi="Garamond" w:cs="Garamond"/>
@@ -8173,7 +8168,62 @@
           <w:u w:val="single"/>
           <w:lang w:val="es-MX"/>
         </w:rPr>
-        <w:t xml:space="preserve"> }}</w:t>
+        <w:t>_SEMI_EXCLUSIVIDAD</w:t>
+      </w:r>
+      <w:r>
+        <w:rPr>
+          <w:rFonts w:ascii="Garamond" w:eastAsia="Garamond" w:hAnsi="Garamond" w:cs="Garamond"/>
+          <w:b/>
+          <w:bCs/>
+          <w:sz w:val="23"/>
+          <w:szCs w:val="23"/>
+          <w:highlight w:val="yellow"/>
+          <w:u w:val="single"/>
+          <w:lang w:val="es-MX"/>
+        </w:rPr>
+        <w:t>|</w:t>
+      </w:r>
+      <w:proofErr w:type="gramStart"/>
+      <w:r>
+        <w:rPr>
+          <w:rFonts w:ascii="Garamond" w:eastAsia="Garamond" w:hAnsi="Garamond" w:cs="Garamond"/>
+          <w:b/>
+          <w:bCs/>
+          <w:sz w:val="23"/>
+          <w:szCs w:val="23"/>
+          <w:highlight w:val="yellow"/>
+          <w:u w:val="single"/>
+          <w:lang w:val="es-MX"/>
+        </w:rPr>
+        <w:t>upper</w:t>
+      </w:r>
+      <w:proofErr w:type="spellEnd"/>
+      <w:r>
+        <w:rPr>
+          <w:rFonts w:ascii="Garamond" w:eastAsia="Garamond" w:hAnsi="Garamond" w:cs="Garamond"/>
+          <w:b/>
+          <w:bCs/>
+          <w:sz w:val="23"/>
+          <w:szCs w:val="23"/>
+          <w:highlight w:val="yellow"/>
+          <w:u w:val="single"/>
+          <w:lang w:val="es-MX"/>
+        </w:rPr>
+        <w:t xml:space="preserve"> }</w:t>
+      </w:r>
+      <w:proofErr w:type="gramEnd"/>
+      <w:r>
+        <w:rPr>
+          <w:rFonts w:ascii="Garamond" w:eastAsia="Garamond" w:hAnsi="Garamond" w:cs="Garamond"/>
+          <w:b/>
+          <w:bCs/>
+          <w:sz w:val="23"/>
+          <w:szCs w:val="23"/>
+          <w:highlight w:val="yellow"/>
+          <w:u w:val="single"/>
+          <w:lang w:val="es-MX"/>
+        </w:rPr>
+        <w:t>}</w:t>
       </w:r>
       <w:r>
         <w:rPr>
@@ -8392,7 +8442,20 @@
           <w:highlight w:val="yellow"/>
           <w:u w:val="single"/>
         </w:rPr>
-        <w:t>{{ NUM</w:t>
+        <w:t xml:space="preserve">{{ </w:t>
+      </w:r>
+      <w:proofErr w:type="spellStart"/>
+      <w:r>
+        <w:rPr>
+          <w:rFonts w:ascii="Garamond" w:eastAsia="Garamond" w:hAnsi="Garamond" w:cs="Garamond"/>
+          <w:b/>
+          <w:bCs/>
+          <w:sz w:val="23"/>
+          <w:szCs w:val="23"/>
+          <w:highlight w:val="yellow"/>
+          <w:u w:val="single"/>
+        </w:rPr>
+        <w:t>NUM</w:t>
       </w:r>
       <w:proofErr w:type="gramEnd"/>
       <w:r>
@@ -8405,7 +8468,19 @@
           <w:highlight w:val="yellow"/>
           <w:u w:val="single"/>
         </w:rPr>
-        <w:t>_INVERSIÓN_</w:t>
+        <w:t>_INVERSIÓN_ADS</w:t>
+      </w:r>
+      <w:r>
+        <w:rPr>
+          <w:rFonts w:ascii="Garamond" w:eastAsia="Garamond" w:hAnsi="Garamond" w:cs="Garamond"/>
+          <w:b/>
+          <w:bCs/>
+          <w:sz w:val="23"/>
+          <w:szCs w:val="23"/>
+          <w:highlight w:val="yellow"/>
+          <w:u w:val="single"/>
+        </w:rPr>
+        <w:t>|</w:t>
       </w:r>
       <w:proofErr w:type="gramStart"/>
       <w:r>
@@ -8418,7 +8493,20 @@
           <w:highlight w:val="yellow"/>
           <w:u w:val="single"/>
         </w:rPr>
-        <w:t>ADS }</w:t>
+        <w:t>upper</w:t>
+      </w:r>
+      <w:proofErr w:type="spellEnd"/>
+      <w:r>
+        <w:rPr>
+          <w:rFonts w:ascii="Garamond" w:eastAsia="Garamond" w:hAnsi="Garamond" w:cs="Garamond"/>
+          <w:b/>
+          <w:bCs/>
+          <w:sz w:val="23"/>
+          <w:szCs w:val="23"/>
+          <w:highlight w:val="yellow"/>
+          <w:u w:val="single"/>
+        </w:rPr>
+        <w:t xml:space="preserve"> }</w:t>
       </w:r>
       <w:proofErr w:type="gramEnd"/>
       <w:r>
@@ -19617,7 +19705,7 @@
                 <w:sz w:val="23"/>
                 <w:szCs w:val="23"/>
               </w:rPr>
-              <w:t>Rappi</w:t>
+              <w:t>Tecnologías Rappi, S.A.P.I. de C.V.</w:t>
             </w:r>
           </w:p>
         </w:tc>
@@ -19677,6 +19765,7 @@
                 <w:bCs/>
                 <w:sz w:val="23"/>
                 <w:szCs w:val="23"/>
+                <w:u w:val="single"/>
               </w:rPr>
             </w:pPr>
             <w:r>
@@ -19718,19 +19807,7 @@
                 <w:szCs w:val="23"/>
                 <w:highlight w:val="yellow"/>
               </w:rPr>
-              <w:t xml:space="preserve">{{ </w:t>
-            </w:r>
-            <w:proofErr w:type="spellStart"/>
-            <w:r>
-              <w:rPr>
-                <w:rFonts w:ascii="Garamond" w:eastAsia="Garamond" w:hAnsi="Garamond" w:cs="Garamond"/>
-                <w:b/>
-                <w:bCs/>
-                <w:sz w:val="23"/>
-                <w:szCs w:val="23"/>
-                <w:highlight w:val="yellow"/>
-              </w:rPr>
-              <w:t>RAZÓN</w:t>
+              <w:t>{{ RAZÓN</w:t>
             </w:r>
             <w:proofErr w:type="gramEnd"/>
             <w:r>
@@ -19742,30 +19819,7 @@
                 <w:szCs w:val="23"/>
                 <w:highlight w:val="yellow"/>
               </w:rPr>
-              <w:t>_SOCIAL</w:t>
-            </w:r>
-            <w:r>
-              <w:rPr>
-                <w:rFonts w:ascii="Garamond" w:eastAsia="Garamond" w:hAnsi="Garamond" w:cs="Garamond"/>
-                <w:b/>
-                <w:bCs/>
-                <w:sz w:val="23"/>
-                <w:szCs w:val="23"/>
-                <w:highlight w:val="yellow"/>
-              </w:rPr>
-              <w:t>|title</w:t>
-            </w:r>
-            <w:proofErr w:type="spellEnd"/>
-            <w:r>
-              <w:rPr>
-                <w:rFonts w:ascii="Garamond" w:eastAsia="Garamond" w:hAnsi="Garamond" w:cs="Garamond"/>
-                <w:b/>
-                <w:bCs/>
-                <w:sz w:val="23"/>
-                <w:szCs w:val="23"/>
-                <w:highlight w:val="yellow"/>
-              </w:rPr>
-              <w:t xml:space="preserve"> }}</w:t>
+              <w:t>_SOCIAL }}</w:t>
             </w:r>
           </w:p>
         </w:tc>
@@ -20188,7 +20242,6 @@
               </w:rPr>
               <w:t xml:space="preserve">Nombre: </w:t>
             </w:r>
-            <w:proofErr w:type="gramStart"/>
             <w:r>
               <w:rPr>
                 <w:rFonts w:ascii="Garamond" w:eastAsia="Garamond" w:hAnsi="Garamond" w:cs="Garamond"/>
@@ -20198,31 +20251,7 @@
                 <w:szCs w:val="23"/>
                 <w:highlight w:val="yellow"/>
               </w:rPr>
-              <w:t xml:space="preserve">{{ </w:t>
-            </w:r>
-            <w:proofErr w:type="spellStart"/>
-            <w:r>
-              <w:rPr>
-                <w:rFonts w:ascii="Garamond" w:eastAsia="Garamond" w:hAnsi="Garamond" w:cs="Garamond"/>
-                <w:b/>
-                <w:bCs/>
-                <w:sz w:val="23"/>
-                <w:szCs w:val="23"/>
-                <w:highlight w:val="yellow"/>
-              </w:rPr>
-              <w:t>REPRESENTANTE</w:t>
-            </w:r>
-            <w:proofErr w:type="gramEnd"/>
-            <w:r>
-              <w:rPr>
-                <w:rFonts w:ascii="Garamond" w:eastAsia="Garamond" w:hAnsi="Garamond" w:cs="Garamond"/>
-                <w:b/>
-                <w:bCs/>
-                <w:sz w:val="23"/>
-                <w:szCs w:val="23"/>
-                <w:highlight w:val="yellow"/>
-              </w:rPr>
-              <w:t>_LEGAL|</w:t>
+              <w:t>{{ REPRESENTANTE_LEGAL</w:t>
             </w:r>
             <w:r>
               <w:rPr>
@@ -20233,9 +20262,8 @@
                 <w:szCs w:val="23"/>
                 <w:highlight w:val="yellow"/>
               </w:rPr>
-              <w:t>title</w:t>
+              <w:t>|title</w:t>
             </w:r>
-            <w:proofErr w:type="spellEnd"/>
             <w:r>
               <w:rPr>
                 <w:rFonts w:ascii="Garamond" w:eastAsia="Garamond" w:hAnsi="Garamond" w:cs="Garamond"/>

</xml_diff>

<commit_message>
Se crea funcion, para agregar los bonos o fondos en la clausula de incumplimientos de manera dinamica.
</commit_message>
<xml_diff>
--- a/formatos/acuerdo_con_ads_juridica.docx
+++ b/formatos/acuerdo_con_ads_juridica.docx
@@ -8128,7 +8128,6 @@
         </w:rPr>
         <w:t xml:space="preserve">CLÁUSULA </w:t>
       </w:r>
-      <w:proofErr w:type="gramStart"/>
       <w:r>
         <w:rPr>
           <w:rFonts w:ascii="Garamond" w:eastAsia="Garamond" w:hAnsi="Garamond" w:cs="Garamond"/>
@@ -8140,9 +8139,8 @@
           <w:u w:val="single"/>
           <w:lang w:val="es-MX"/>
         </w:rPr>
-        <w:t xml:space="preserve">{{ </w:t>
-      </w:r>
-      <w:proofErr w:type="spellStart"/>
+        <w:t>{{ NUM_SEMI_EXCLUSIVIDAD</w:t>
+      </w:r>
       <w:r>
         <w:rPr>
           <w:rFonts w:ascii="Garamond" w:eastAsia="Garamond" w:hAnsi="Garamond" w:cs="Garamond"/>
@@ -8154,9 +8152,8 @@
           <w:u w:val="single"/>
           <w:lang w:val="es-MX"/>
         </w:rPr>
-        <w:t>NUM</w:t>
-      </w:r>
-      <w:proofErr w:type="gramEnd"/>
+        <w:t>|upper</w:t>
+      </w:r>
       <w:r>
         <w:rPr>
           <w:rFonts w:ascii="Garamond" w:eastAsia="Garamond" w:hAnsi="Garamond" w:cs="Garamond"/>
@@ -8168,62 +8165,7 @@
           <w:u w:val="single"/>
           <w:lang w:val="es-MX"/>
         </w:rPr>
-        <w:t>_SEMI_EXCLUSIVIDAD</w:t>
-      </w:r>
-      <w:r>
-        <w:rPr>
-          <w:rFonts w:ascii="Garamond" w:eastAsia="Garamond" w:hAnsi="Garamond" w:cs="Garamond"/>
-          <w:b/>
-          <w:bCs/>
-          <w:sz w:val="23"/>
-          <w:szCs w:val="23"/>
-          <w:highlight w:val="yellow"/>
-          <w:u w:val="single"/>
-          <w:lang w:val="es-MX"/>
-        </w:rPr>
-        <w:t>|</w:t>
-      </w:r>
-      <w:proofErr w:type="gramStart"/>
-      <w:r>
-        <w:rPr>
-          <w:rFonts w:ascii="Garamond" w:eastAsia="Garamond" w:hAnsi="Garamond" w:cs="Garamond"/>
-          <w:b/>
-          <w:bCs/>
-          <w:sz w:val="23"/>
-          <w:szCs w:val="23"/>
-          <w:highlight w:val="yellow"/>
-          <w:u w:val="single"/>
-          <w:lang w:val="es-MX"/>
-        </w:rPr>
-        <w:t>upper</w:t>
-      </w:r>
-      <w:proofErr w:type="spellEnd"/>
-      <w:r>
-        <w:rPr>
-          <w:rFonts w:ascii="Garamond" w:eastAsia="Garamond" w:hAnsi="Garamond" w:cs="Garamond"/>
-          <w:b/>
-          <w:bCs/>
-          <w:sz w:val="23"/>
-          <w:szCs w:val="23"/>
-          <w:highlight w:val="yellow"/>
-          <w:u w:val="single"/>
-          <w:lang w:val="es-MX"/>
-        </w:rPr>
-        <w:t xml:space="preserve"> }</w:t>
-      </w:r>
-      <w:proofErr w:type="gramEnd"/>
-      <w:r>
-        <w:rPr>
-          <w:rFonts w:ascii="Garamond" w:eastAsia="Garamond" w:hAnsi="Garamond" w:cs="Garamond"/>
-          <w:b/>
-          <w:bCs/>
-          <w:sz w:val="23"/>
-          <w:szCs w:val="23"/>
-          <w:highlight w:val="yellow"/>
-          <w:u w:val="single"/>
-          <w:lang w:val="es-MX"/>
-        </w:rPr>
-        <w:t>}</w:t>
+        <w:t xml:space="preserve"> }}</w:t>
       </w:r>
       <w:r>
         <w:rPr>
@@ -8857,6 +8799,17 @@
           <w:rFonts w:ascii="Garamond" w:eastAsia="Garamond" w:hAnsi="Garamond" w:cs="Garamond"/>
           <w:sz w:val="23"/>
           <w:szCs w:val="23"/>
+          <w:u w:val="single"/>
+        </w:rPr>
+      </w:pPr>
+    </w:p>
+    <w:p>
+      <w:pPr>
+        <w:jc w:val="both"/>
+        <w:rPr>
+          <w:rFonts w:ascii="Garamond" w:eastAsia="Garamond" w:hAnsi="Garamond" w:cs="Garamond"/>
+          <w:sz w:val="23"/>
+          <w:szCs w:val="23"/>
         </w:rPr>
       </w:pPr>
       <w:r>
@@ -9144,7 +9097,7 @@
           <w:szCs w:val="23"/>
         </w:rPr>
         <w:br/>
-        <w:t xml:space="preserve">El Aliado Comercial acepta y reconoce que deberá de sacar en paz y a salvo a Rappi de cualquier sanción fiscal y financiera que, en su caso, las autoridades tributarias pudieren imponer al Aliado </w:t>
+        <w:t xml:space="preserve">El Aliado Comercial acepta y reconoce que deberá de sacar en paz y a salvo a Rappi de cualquier </w:t>
       </w:r>
       <w:r>
         <w:rPr>
@@ -9153,7 +9106,7 @@
           <w:szCs w:val="23"/>
         </w:rPr>
         <w:lastRenderedPageBreak/>
-        <w:t>Comercial con respecto al Bono de Crecimiento.</w:t>
+        <w:t>sanción fiscal y financiera que, en su caso, las autoridades tributarias pudieren imponer al Aliado Comercial con respecto al Bono de Crecimiento.</w:t>
       </w:r>
     </w:p>
     <w:p>
@@ -10302,7 +10255,7 @@
           <w:sz w:val="23"/>
           <w:szCs w:val="23"/>
         </w:rPr>
-        <w:t xml:space="preserve"> meses de permanencia en la Plataforma Rappi, contados a partir de la apertura de cada Establecimiento de Comercio. Si la Vigencia Inicial del Acuerdo fuera inferior a dicho periodo, la vigencia se entenderá automáticamente prorrogada por el tiempo necesario para completar la amortización de cada Establecimiento de Comercio, sin necesidad de </w:t>
+        <w:t xml:space="preserve"> meses de permanencia en la Plataforma Rappi, contados a partir de la apertura de cada Establecimiento de Comercio. Si la Vigencia Inicial del Acuerdo fuera inferior a dicho periodo, la vigencia se entenderá automáticamente prorrogada por el tiempo </w:t>
       </w:r>
       <w:r>
         <w:rPr>
@@ -10311,7 +10264,7 @@
           <w:szCs w:val="23"/>
         </w:rPr>
         <w:lastRenderedPageBreak/>
-        <w:t>suscribir un nuevo documento.</w:t>
+        <w:t>necesario para completar la amortización de cada Establecimiento de Comercio, sin necesidad de suscribir un nuevo documento.</w:t>
       </w:r>
       <w:r>
         <w:rPr>
@@ -11149,7 +11102,7 @@
           <w:szCs w:val="23"/>
         </w:rPr>
         <w:br/>
-        <w:t xml:space="preserve">El desembolso del Bono de Crecimiento deberá realizarse una vez que el Aliado emita a Rappi la factura, con todos los requisitos legales aplicables, haya sido debidamente cargada y aceptada en el </w:t>
+        <w:t xml:space="preserve">El desembolso del Bono de Crecimiento deberá realizarse una vez que el Aliado emita a Rappi la </w:t>
       </w:r>
       <w:r>
         <w:rPr>
@@ -11158,7 +11111,7 @@
           <w:szCs w:val="23"/>
         </w:rPr>
         <w:lastRenderedPageBreak/>
-        <w:t xml:space="preserve">sistema de registro de Rappi. Rappi no cobrará ningún interés ni costo financiero sobre el Bono de Crecimiento y el mismo tendrá </w:t>
+        <w:t xml:space="preserve">factura, con todos los requisitos legales aplicables, haya sido debidamente cargada y aceptada en el sistema de registro de Rappi. Rappi no cobrará ningún interés ni costo financiero sobre el Bono de Crecimiento y el mismo tendrá </w:t>
       </w:r>
       <w:r>
         <w:rPr>
@@ -12597,15 +12550,8 @@
           <w:sz w:val="23"/>
           <w:szCs w:val="23"/>
         </w:rPr>
+        <w:lastRenderedPageBreak/>
         <w:br/>
-      </w:r>
-      <w:r>
-        <w:rPr>
-          <w:rFonts w:ascii="Garamond" w:eastAsia="Garamond" w:hAnsi="Garamond" w:cs="Garamond"/>
-          <w:sz w:val="23"/>
-          <w:szCs w:val="23"/>
-        </w:rPr>
-        <w:lastRenderedPageBreak/>
         <w:t xml:space="preserve">Para el desembolso de alguna suma de dinero de la Línea de Crédito NA, las Partes deberán suscribir un anexo al presente Acuerdo, donde se establecerá el monto a desembolsar por Rappi y las condiciones de entrega y pago, así como su respectivo pagaré. Dicho anexo únicamente se suscribirá una vez el Aliado proporcione a Rappi las evidencias fehacientes de los gastos correspondientes a la construcción de la cocina y/o sucursal (por ejemplo: contratos, facturas, cotizaciones). </w:t>
       </w:r>
       <w:r>
@@ -12950,23 +12896,32 @@
           <w:sz w:val="23"/>
           <w:szCs w:val="23"/>
         </w:rPr>
-        <w:t xml:space="preserve">) Rappi rescinda el Acuerdo por causas imputables al Aliado (en adelante “Incumplimiento”), entonces el Aliado deberá devolver íntegramente las cantidades que Rappi haya otorgado por concepto de "Bono de Firma, Bono de Mercadotecnia, Bono de Crecimiento, Bono de Desempeño, Fondo de Mercadotecnia, </w:t>
-      </w:r>
-      <w:r>
-        <w:rPr>
-          <w:rFonts w:ascii="Garamond" w:eastAsia="Garamond" w:hAnsi="Garamond" w:cs="Garamond"/>
-          <w:sz w:val="23"/>
-          <w:szCs w:val="23"/>
-        </w:rPr>
-        <w:t>“</w:t>
-      </w:r>
-      <w:r>
-        <w:rPr>
-          <w:rFonts w:ascii="Garamond" w:eastAsia="Garamond" w:hAnsi="Garamond" w:cs="Garamond"/>
-          <w:sz w:val="23"/>
-          <w:szCs w:val="23"/>
-        </w:rPr>
-        <w:t>Fondo de Crecimiento"</w:t>
+        <w:t xml:space="preserve">) Rappi rescinda el </w:t>
+      </w:r>
+      <w:r>
+        <w:rPr>
+          <w:rFonts w:ascii="Garamond" w:eastAsia="Garamond" w:hAnsi="Garamond" w:cs="Garamond"/>
+          <w:sz w:val="23"/>
+          <w:szCs w:val="23"/>
+          <w:u w:val="single"/>
+        </w:rPr>
+        <w:t>Acuerdo</w:t>
+      </w:r>
+      <w:r>
+        <w:rPr>
+          <w:rFonts w:ascii="Garamond" w:eastAsia="Garamond" w:hAnsi="Garamond" w:cs="Garamond"/>
+          <w:sz w:val="23"/>
+          <w:szCs w:val="23"/>
+        </w:rPr>
+        <w:t xml:space="preserve"> por causas imputables al Aliado (en adelante “Incumplimiento”), entonces el Aliado deberá devolver íntegramente las cantidades que Rappi haya otorgado por concepto de </w:t>
+      </w:r>
+      <w:r>
+        <w:rPr>
+          <w:rFonts w:ascii="Garamond" w:eastAsia="Garamond" w:hAnsi="Garamond" w:cs="Garamond"/>
+          <w:sz w:val="23"/>
+          <w:szCs w:val="23"/>
+        </w:rPr>
+        <w:t>"{{ LISTA_BONOS_FONDOS }}"</w:t>
       </w:r>
       <w:r>
         <w:rPr>

</xml_diff>